<commit_message>
Changing the test case specification purchase
</commit_message>
<xml_diff>
--- a/test/AppForSEII2526.UIT/UC_Purchase/Test case specification Purchase.docx
+++ b/test/AppForSEII2526.UIT/UC_Purchase/Test case specification Purchase.docx
@@ -860,606 +860,15 @@
       </w:r>
       <w:bookmarkEnd w:id="0"/>
       <w:r>
-        <w:t xml:space="preserve"> (code we use for testing =&gt; address github + id for the version (label de version))</w:t>
+        <w:t xml:space="preserve"> </w:t>
       </w:r>
     </w:p>
     <w:p>
       <w:pPr>
-        <w:pStyle w:val="BodyText"/>
-        <w:kinsoku w:val="0"/>
-        <w:overflowPunct w:val="0"/>
-        <w:spacing w:line="500" w:lineRule="auto"/>
-        <w:ind w:right="1866"/>
-        <w:rPr>
-          <w:w w:val="95"/>
-        </w:rPr>
+        <w:ind w:left="708"/>
       </w:pPr>
       <w:r>
-        <w:rPr>
-          <w:w w:val="95"/>
-        </w:rPr>
-        <w:t>Identify</w:t>
-      </w:r>
-      <w:r>
-        <w:rPr>
-          <w:spacing w:val="-30"/>
-          <w:w w:val="95"/>
-        </w:rPr>
-        <w:t xml:space="preserve"> </w:t>
-      </w:r>
-      <w:r>
-        <w:rPr>
-          <w:w w:val="95"/>
-        </w:rPr>
-        <w:t>and</w:t>
-      </w:r>
-      <w:r>
-        <w:rPr>
-          <w:spacing w:val="-31"/>
-          <w:w w:val="95"/>
-        </w:rPr>
-        <w:t xml:space="preserve"> </w:t>
-      </w:r>
-      <w:r>
-        <w:rPr>
-          <w:w w:val="95"/>
-        </w:rPr>
-        <w:t>briefly</w:t>
-      </w:r>
-      <w:r>
-        <w:rPr>
-          <w:spacing w:val="-29"/>
-          <w:w w:val="95"/>
-        </w:rPr>
-        <w:t xml:space="preserve"> </w:t>
-      </w:r>
-      <w:r>
-        <w:rPr>
-          <w:w w:val="95"/>
-        </w:rPr>
-        <w:t>describe</w:t>
-      </w:r>
-      <w:r>
-        <w:rPr>
-          <w:spacing w:val="-30"/>
-          <w:w w:val="95"/>
-        </w:rPr>
-        <w:t xml:space="preserve"> </w:t>
-      </w:r>
-      <w:r>
-        <w:rPr>
-          <w:w w:val="95"/>
-        </w:rPr>
-        <w:t>the</w:t>
-      </w:r>
-      <w:r>
-        <w:rPr>
-          <w:spacing w:val="-30"/>
-          <w:w w:val="95"/>
-        </w:rPr>
-        <w:t xml:space="preserve"> </w:t>
-      </w:r>
-      <w:r>
-        <w:rPr>
-          <w:w w:val="95"/>
-        </w:rPr>
-        <w:t>items</w:t>
-      </w:r>
-      <w:r>
-        <w:rPr>
-          <w:spacing w:val="-31"/>
-          <w:w w:val="95"/>
-        </w:rPr>
-        <w:t xml:space="preserve"> </w:t>
-      </w:r>
-      <w:r>
-        <w:rPr>
-          <w:w w:val="95"/>
-        </w:rPr>
-        <w:t>and</w:t>
-      </w:r>
-      <w:r>
-        <w:rPr>
-          <w:spacing w:val="-30"/>
-          <w:w w:val="95"/>
-        </w:rPr>
-        <w:t xml:space="preserve"> </w:t>
-      </w:r>
-      <w:r>
-        <w:rPr>
-          <w:w w:val="95"/>
-        </w:rPr>
-        <w:t>features</w:t>
-      </w:r>
-      <w:r>
-        <w:rPr>
-          <w:spacing w:val="-30"/>
-          <w:w w:val="95"/>
-        </w:rPr>
-        <w:t xml:space="preserve"> </w:t>
-      </w:r>
-      <w:r>
-        <w:rPr>
-          <w:w w:val="95"/>
-        </w:rPr>
-        <w:t>to</w:t>
-      </w:r>
-      <w:r>
-        <w:rPr>
-          <w:spacing w:val="-30"/>
-          <w:w w:val="95"/>
-        </w:rPr>
-        <w:t xml:space="preserve"> </w:t>
-      </w:r>
-      <w:r>
-        <w:rPr>
-          <w:w w:val="95"/>
-        </w:rPr>
-        <w:t>be</w:t>
-      </w:r>
-      <w:r>
-        <w:rPr>
-          <w:spacing w:val="-30"/>
-          <w:w w:val="95"/>
-        </w:rPr>
-        <w:t xml:space="preserve"> </w:t>
-      </w:r>
-      <w:r>
-        <w:rPr>
-          <w:spacing w:val="-2"/>
-          <w:w w:val="95"/>
-        </w:rPr>
-        <w:t>e</w:t>
-      </w:r>
-      <w:r>
-        <w:rPr>
-          <w:spacing w:val="-1"/>
-          <w:w w:val="95"/>
-        </w:rPr>
-        <w:t>x</w:t>
-      </w:r>
-      <w:r>
-        <w:rPr>
-          <w:spacing w:val="-2"/>
-          <w:w w:val="95"/>
-        </w:rPr>
-        <w:t>ercised</w:t>
-      </w:r>
-      <w:r>
-        <w:rPr>
-          <w:spacing w:val="-30"/>
-          <w:w w:val="95"/>
-        </w:rPr>
-        <w:t xml:space="preserve"> </w:t>
-      </w:r>
-      <w:r>
-        <w:rPr>
-          <w:w w:val="95"/>
-        </w:rPr>
-        <w:t>by</w:t>
-      </w:r>
-      <w:r>
-        <w:rPr>
-          <w:spacing w:val="-30"/>
-          <w:w w:val="95"/>
-        </w:rPr>
-        <w:t xml:space="preserve"> </w:t>
-      </w:r>
-      <w:r>
-        <w:rPr>
-          <w:w w:val="95"/>
-        </w:rPr>
-        <w:t>this</w:t>
-      </w:r>
-      <w:r>
-        <w:rPr>
-          <w:spacing w:val="-30"/>
-          <w:w w:val="95"/>
-        </w:rPr>
-        <w:t xml:space="preserve"> </w:t>
-      </w:r>
-      <w:r>
-        <w:rPr>
-          <w:w w:val="95"/>
-        </w:rPr>
-        <w:t>test</w:t>
-      </w:r>
-      <w:r>
-        <w:rPr>
-          <w:spacing w:val="-31"/>
-          <w:w w:val="95"/>
-        </w:rPr>
-        <w:t xml:space="preserve"> </w:t>
-      </w:r>
-      <w:r>
-        <w:rPr>
-          <w:w w:val="95"/>
-        </w:rPr>
-        <w:t>case.</w:t>
-      </w:r>
-      <w:r>
-        <w:rPr>
-          <w:rFonts w:ascii="Times New Roman" w:hAnsi="Times New Roman"/>
-          <w:w w:val="82"/>
-        </w:rPr>
-        <w:t xml:space="preserve"> </w:t>
-      </w:r>
-      <w:r>
-        <w:rPr>
-          <w:rFonts w:ascii="Times New Roman" w:hAnsi="Times New Roman"/>
-          <w:spacing w:val="23"/>
-          <w:w w:val="82"/>
-        </w:rPr>
-        <w:t xml:space="preserve"> </w:t>
-      </w:r>
-      <w:r>
-        <w:rPr>
-          <w:spacing w:val="-3"/>
-          <w:w w:val="95"/>
-        </w:rPr>
-        <w:t>For</w:t>
-      </w:r>
-      <w:r>
-        <w:rPr>
-          <w:spacing w:val="-31"/>
-          <w:w w:val="95"/>
-        </w:rPr>
-        <w:t xml:space="preserve"> </w:t>
-      </w:r>
-      <w:r>
-        <w:rPr>
-          <w:w w:val="95"/>
-        </w:rPr>
-        <w:t>each</w:t>
-      </w:r>
-      <w:r>
-        <w:rPr>
-          <w:spacing w:val="-31"/>
-          <w:w w:val="95"/>
-        </w:rPr>
-        <w:t xml:space="preserve"> </w:t>
-      </w:r>
-      <w:r>
-        <w:rPr>
-          <w:w w:val="95"/>
-        </w:rPr>
-        <w:t>item,</w:t>
-      </w:r>
-      <w:r>
-        <w:rPr>
-          <w:spacing w:val="-31"/>
-          <w:w w:val="95"/>
-        </w:rPr>
-        <w:t xml:space="preserve"> </w:t>
-      </w:r>
-      <w:r>
-        <w:rPr>
-          <w:w w:val="95"/>
-        </w:rPr>
-        <w:t>consider</w:t>
-      </w:r>
-      <w:r>
-        <w:rPr>
-          <w:spacing w:val="-31"/>
-          <w:w w:val="95"/>
-        </w:rPr>
-        <w:t xml:space="preserve"> </w:t>
-      </w:r>
-      <w:r>
-        <w:rPr>
-          <w:spacing w:val="-1"/>
-          <w:w w:val="95"/>
-        </w:rPr>
-        <w:t>supplying</w:t>
-      </w:r>
-      <w:r>
-        <w:rPr>
-          <w:spacing w:val="-31"/>
-          <w:w w:val="95"/>
-        </w:rPr>
-        <w:t xml:space="preserve"> </w:t>
-      </w:r>
-      <w:r>
-        <w:rPr>
-          <w:w w:val="95"/>
-        </w:rPr>
-        <w:t>references</w:t>
-      </w:r>
-      <w:r>
-        <w:rPr>
-          <w:spacing w:val="-31"/>
-          <w:w w:val="95"/>
-        </w:rPr>
-        <w:t xml:space="preserve"> </w:t>
-      </w:r>
-      <w:r>
-        <w:rPr>
-          <w:w w:val="95"/>
-        </w:rPr>
-        <w:t>to</w:t>
-      </w:r>
-      <w:r>
-        <w:rPr>
-          <w:spacing w:val="-31"/>
-          <w:w w:val="95"/>
-        </w:rPr>
-        <w:t xml:space="preserve"> </w:t>
-      </w:r>
-      <w:r>
-        <w:rPr>
-          <w:w w:val="95"/>
-        </w:rPr>
-        <w:t>the</w:t>
-      </w:r>
-      <w:r>
-        <w:rPr>
-          <w:spacing w:val="-31"/>
-          <w:w w:val="95"/>
-        </w:rPr>
-        <w:t xml:space="preserve"> </w:t>
-      </w:r>
-      <w:r>
-        <w:rPr>
-          <w:spacing w:val="-1"/>
-          <w:w w:val="95"/>
-        </w:rPr>
-        <w:t>following</w:t>
-      </w:r>
-      <w:r>
-        <w:rPr>
-          <w:spacing w:val="-30"/>
-          <w:w w:val="95"/>
-        </w:rPr>
-        <w:t xml:space="preserve"> </w:t>
-      </w:r>
-      <w:r>
-        <w:rPr>
-          <w:w w:val="95"/>
-        </w:rPr>
-        <w:t>test</w:t>
-      </w:r>
-      <w:r>
-        <w:rPr>
-          <w:spacing w:val="-31"/>
-          <w:w w:val="95"/>
-        </w:rPr>
-        <w:t xml:space="preserve"> </w:t>
-      </w:r>
-      <w:r>
-        <w:rPr>
-          <w:w w:val="95"/>
-        </w:rPr>
-        <w:t>item</w:t>
-      </w:r>
-      <w:r>
-        <w:rPr>
-          <w:spacing w:val="-31"/>
-          <w:w w:val="95"/>
-        </w:rPr>
-        <w:t xml:space="preserve"> </w:t>
-      </w:r>
-      <w:r>
-        <w:rPr>
-          <w:w w:val="95"/>
-        </w:rPr>
-        <w:t>documentation:</w:t>
-      </w:r>
-    </w:p>
-    <w:p>
-      <w:pPr>
-        <w:pStyle w:val="BodyText"/>
-        <w:kinsoku w:val="0"/>
-        <w:overflowPunct w:val="0"/>
-        <w:spacing w:line="500" w:lineRule="auto"/>
-        <w:ind w:right="1866"/>
-      </w:pPr>
-      <w:r>
-        <w:t>GITHUB URL and Version:</w:t>
-      </w:r>
-    </w:p>
-    <w:p>
-      <w:pPr>
-        <w:pStyle w:val="BodyText"/>
-        <w:keepLines w:val="0"/>
-        <w:numPr>
-          <w:ilvl w:val="3"/>
-          <w:numId w:val="3"/>
-        </w:numPr>
-        <w:tabs>
-          <w:tab w:val="left" w:pos="781"/>
-        </w:tabs>
-        <w:kinsoku w:val="0"/>
-        <w:overflowPunct w:val="0"/>
-        <w:autoSpaceDE w:val="0"/>
-        <w:autoSpaceDN w:val="0"/>
-        <w:adjustRightInd w:val="0"/>
-        <w:spacing w:before="7" w:after="0" w:line="240" w:lineRule="auto"/>
-        <w:ind w:hanging="440"/>
-        <w:jc w:val="left"/>
-      </w:pPr>
-      <w:r>
-        <w:rPr>
-          <w:w w:val="90"/>
-        </w:rPr>
-        <w:t>Requirements</w:t>
-      </w:r>
-      <w:r>
-        <w:rPr>
-          <w:spacing w:val="10"/>
-          <w:w w:val="90"/>
-        </w:rPr>
-        <w:t xml:space="preserve"> </w:t>
-      </w:r>
-      <w:r>
-        <w:rPr>
-          <w:spacing w:val="-1"/>
-          <w:w w:val="90"/>
-        </w:rPr>
-        <w:t>specification;</w:t>
-      </w:r>
-    </w:p>
-    <w:p>
-      <w:pPr>
-        <w:pStyle w:val="BodyText"/>
-        <w:keepLines w:val="0"/>
-        <w:numPr>
-          <w:ilvl w:val="3"/>
-          <w:numId w:val="3"/>
-        </w:numPr>
-        <w:tabs>
-          <w:tab w:val="left" w:pos="781"/>
-        </w:tabs>
-        <w:kinsoku w:val="0"/>
-        <w:overflowPunct w:val="0"/>
-        <w:autoSpaceDE w:val="0"/>
-        <w:autoSpaceDN w:val="0"/>
-        <w:adjustRightInd w:val="0"/>
-        <w:spacing w:before="10" w:after="0" w:line="240" w:lineRule="auto"/>
-        <w:ind w:hanging="440"/>
-        <w:jc w:val="left"/>
-      </w:pPr>
-      <w:r>
-        <w:rPr>
-          <w:spacing w:val="-1"/>
-          <w:w w:val="90"/>
-        </w:rPr>
-        <w:t>Design</w:t>
-      </w:r>
-      <w:r>
-        <w:rPr>
-          <w:spacing w:val="29"/>
-          <w:w w:val="90"/>
-        </w:rPr>
-        <w:t xml:space="preserve"> </w:t>
-      </w:r>
-      <w:r>
-        <w:rPr>
-          <w:spacing w:val="-1"/>
-          <w:w w:val="90"/>
-        </w:rPr>
-        <w:t>specification;</w:t>
-      </w:r>
-    </w:p>
-    <w:p>
-      <w:pPr>
-        <w:pStyle w:val="BodyText"/>
-        <w:keepLines w:val="0"/>
-        <w:numPr>
-          <w:ilvl w:val="3"/>
-          <w:numId w:val="3"/>
-        </w:numPr>
-        <w:tabs>
-          <w:tab w:val="left" w:pos="781"/>
-        </w:tabs>
-        <w:kinsoku w:val="0"/>
-        <w:overflowPunct w:val="0"/>
-        <w:autoSpaceDE w:val="0"/>
-        <w:autoSpaceDN w:val="0"/>
-        <w:adjustRightInd w:val="0"/>
-        <w:spacing w:before="10" w:after="0" w:line="240" w:lineRule="auto"/>
-        <w:ind w:hanging="440"/>
-        <w:jc w:val="left"/>
-      </w:pPr>
-      <w:r>
-        <w:rPr>
-          <w:spacing w:val="-2"/>
-          <w:w w:val="90"/>
-        </w:rPr>
-        <w:t>Users</w:t>
-      </w:r>
-      <w:r>
-        <w:rPr>
-          <w:spacing w:val="-6"/>
-          <w:w w:val="90"/>
-        </w:rPr>
-        <w:t xml:space="preserve"> </w:t>
-      </w:r>
-      <w:r>
-        <w:rPr>
-          <w:w w:val="90"/>
-        </w:rPr>
-        <w:t>guide;</w:t>
-      </w:r>
-    </w:p>
-    <w:p>
-      <w:pPr>
-        <w:pStyle w:val="BodyText"/>
-        <w:keepLines w:val="0"/>
-        <w:numPr>
-          <w:ilvl w:val="3"/>
-          <w:numId w:val="3"/>
-        </w:numPr>
-        <w:tabs>
-          <w:tab w:val="left" w:pos="781"/>
-        </w:tabs>
-        <w:kinsoku w:val="0"/>
-        <w:overflowPunct w:val="0"/>
-        <w:autoSpaceDE w:val="0"/>
-        <w:autoSpaceDN w:val="0"/>
-        <w:adjustRightInd w:val="0"/>
-        <w:spacing w:before="10" w:after="0" w:line="240" w:lineRule="auto"/>
-        <w:ind w:hanging="440"/>
-        <w:jc w:val="left"/>
-      </w:pPr>
-      <w:r>
-        <w:rPr>
-          <w:spacing w:val="-1"/>
-          <w:w w:val="90"/>
-        </w:rPr>
-        <w:t>Operations</w:t>
-      </w:r>
-      <w:r>
-        <w:rPr>
-          <w:spacing w:val="-5"/>
-          <w:w w:val="90"/>
-        </w:rPr>
-        <w:t xml:space="preserve"> </w:t>
-      </w:r>
-      <w:r>
-        <w:rPr>
-          <w:w w:val="90"/>
-        </w:rPr>
-        <w:t>guide;</w:t>
-      </w:r>
-    </w:p>
-    <w:p>
-      <w:pPr>
-        <w:pStyle w:val="BodyText"/>
-        <w:keepLines w:val="0"/>
-        <w:numPr>
-          <w:ilvl w:val="3"/>
-          <w:numId w:val="3"/>
-        </w:numPr>
-        <w:tabs>
-          <w:tab w:val="left" w:pos="781"/>
-        </w:tabs>
-        <w:kinsoku w:val="0"/>
-        <w:overflowPunct w:val="0"/>
-        <w:autoSpaceDE w:val="0"/>
-        <w:autoSpaceDN w:val="0"/>
-        <w:adjustRightInd w:val="0"/>
-        <w:spacing w:before="10" w:after="0" w:line="240" w:lineRule="auto"/>
-        <w:ind w:hanging="440"/>
-        <w:jc w:val="left"/>
-      </w:pPr>
-      <w:r>
-        <w:rPr>
-          <w:w w:val="90"/>
-        </w:rPr>
-        <w:t>Installation</w:t>
-      </w:r>
-      <w:r>
-        <w:rPr>
-          <w:spacing w:val="38"/>
-          <w:w w:val="90"/>
-        </w:rPr>
-        <w:t xml:space="preserve"> </w:t>
-      </w:r>
-      <w:r>
-        <w:rPr>
-          <w:w w:val="90"/>
-        </w:rPr>
-        <w:t>guide.</w:t>
+        <w:t>Purchase Items</w:t>
       </w:r>
     </w:p>
     <w:p>
@@ -1472,10 +881,7 @@
       </w:r>
       <w:bookmarkEnd w:id="3"/>
       <w:r>
-        <w:t xml:space="preserve"> (Alternative flows</w:t>
-      </w:r>
-      <w:r>
-        <w:t xml:space="preserve"> +1)</w:t>
+        <w:t xml:space="preserve"> </w:t>
       </w:r>
     </w:p>
     <w:tbl>
@@ -1668,13 +1074,21 @@
         <w:t>Nike</w:t>
       </w:r>
       <w:r>
-        <w:t>”,</w:t>
-      </w:r>
-      <w:r>
-        <w:t xml:space="preserve"> </w:t>
-      </w:r>
-      <w:r>
-        <w:t>”Set of bands”,</w:t>
+        <w:t>”</w:t>
+      </w:r>
+      <w:proofErr w:type="gramStart"/>
+      <w:r>
+        <w:t>,</w:t>
+      </w:r>
+      <w:r>
+        <w:t xml:space="preserve"> </w:t>
+      </w:r>
+      <w:r>
+        <w:t>”Set</w:t>
+      </w:r>
+      <w:proofErr w:type="gramEnd"/>
+      <w:r>
+        <w:t xml:space="preserve"> of bands”,</w:t>
       </w:r>
       <w:r>
         <w:t xml:space="preserve"> 15.00, 20</w:t>
@@ -1688,7 +1102,15 @@
         <w:t>Foam Roller</w:t>
       </w:r>
       <w:r>
-        <w:t>”, ”Adidas”,”</w:t>
+        <w:t>”</w:t>
+      </w:r>
+      <w:proofErr w:type="gramStart"/>
+      <w:r>
+        <w:t>, ”Adidas</w:t>
+      </w:r>
+      <w:proofErr w:type="gramEnd"/>
+      <w:r>
+        <w:t>”,”</w:t>
       </w:r>
       <w:r>
         <w:t xml:space="preserve"> Foam roller for muscle recovery and massage</w:t>
@@ -1705,10 +1127,26 @@
         <w:t>Kettlebell 10 kg</w:t>
       </w:r>
       <w:r>
-        <w:t>”,”Domyos”, ”</w:t>
-      </w:r>
-      <w:r>
-        <w:t>Ideal for strength and endurance training</w:t>
+        <w:t>”</w:t>
+      </w:r>
+      <w:proofErr w:type="gramStart"/>
+      <w:r>
+        <w:t>,”Domyos</w:t>
+      </w:r>
+      <w:proofErr w:type="gramEnd"/>
+      <w:r>
+        <w:t>”</w:t>
+      </w:r>
+      <w:proofErr w:type="gramStart"/>
+      <w:r>
+        <w:t>, ”</w:t>
+      </w:r>
+      <w:r>
+        <w:t>Ideal</w:t>
+      </w:r>
+      <w:proofErr w:type="gramEnd"/>
+      <w:r>
+        <w:t xml:space="preserve"> for strength and endurance training</w:t>
       </w:r>
       <w:r>
         <w:t>”,25.00,15</w:t>
@@ -1757,7 +1195,15 @@
           </w:tcPr>
           <w:p>
             <w:r>
-              <w:t xml:space="preserve">Items shown(Name, </w:t>
+              <w:t xml:space="preserve">Items </w:t>
+            </w:r>
+            <w:proofErr w:type="gramStart"/>
+            <w:r>
+              <w:t>shown(</w:t>
+            </w:r>
+            <w:proofErr w:type="gramEnd"/>
+            <w:r>
+              <w:t xml:space="preserve">Name, </w:t>
             </w:r>
             <w:r>
               <w:t>Brand, description</w:t>
@@ -2011,7 +1457,15 @@
           </w:p>
           <w:p>
             <w:r>
-              <w:t xml:space="preserve">  brand:”Adidas”</w:t>
+              <w:t xml:space="preserve">  brand</w:t>
+            </w:r>
+            <w:proofErr w:type="gramStart"/>
+            <w:r>
+              <w:t>:”Adidas</w:t>
+            </w:r>
+            <w:proofErr w:type="gramEnd"/>
+            <w:r>
+              <w:t>”</w:t>
             </w:r>
           </w:p>
           <w:p>
@@ -2374,7 +1828,15 @@
           </w:p>
           <w:p>
             <w:r>
-              <w:t>“Foam Roller”,”Adidas”</w:t>
+              <w:t>“Foam Roller”</w:t>
+            </w:r>
+            <w:proofErr w:type="gramStart"/>
+            <w:r>
+              <w:t>,”Adidas</w:t>
+            </w:r>
+            <w:proofErr w:type="gramEnd"/>
+            <w:r>
+              <w:t>”</w:t>
             </w:r>
           </w:p>
           <w:p>
@@ -2407,7 +1869,15 @@
               <w:t xml:space="preserve">Renting Cart only shows </w:t>
             </w:r>
             <w:r>
-              <w:t>“Foam Roller”,”Adidas”</w:t>
+              <w:t>“Foam Roller”</w:t>
+            </w:r>
+            <w:proofErr w:type="gramStart"/>
+            <w:r>
+              <w:t>,”Adidas</w:t>
+            </w:r>
+            <w:proofErr w:type="gramEnd"/>
+            <w:r>
+              <w:t>”</w:t>
             </w:r>
           </w:p>
           <w:p/>
@@ -2539,8 +2009,13 @@
             <w:tcW w:w="3595" w:type="dxa"/>
           </w:tcPr>
           <w:p>
-            <w:r>
-              <w:t>The field CustomerUserName must be a string with a minimum length of 10 and a maximum length of 50.</w:t>
+            <w:proofErr w:type="gramStart"/>
+            <w:r>
+              <w:t>The field CustomerUserName</w:t>
+            </w:r>
+            <w:proofErr w:type="gramEnd"/>
+            <w:r>
+              <w:t xml:space="preserve"> must be a string with a minimum length of 10 and a maximum length of 50.</w:t>
             </w:r>
           </w:p>
         </w:tc>
@@ -3198,7 +2673,23 @@
               <w:t>T</w:t>
             </w:r>
             <w:r>
-              <w:t xml:space="preserve">here are not more stock for the item </w:t>
+              <w:t xml:space="preserve">here </w:t>
+            </w:r>
+            <w:proofErr w:type="gramStart"/>
+            <w:r>
+              <w:t>are</w:t>
+            </w:r>
+            <w:proofErr w:type="gramEnd"/>
+            <w:r>
+              <w:t xml:space="preserve"> not </w:t>
+            </w:r>
+            <w:proofErr w:type="gramStart"/>
+            <w:r>
+              <w:t>more</w:t>
+            </w:r>
+            <w:proofErr w:type="gramEnd"/>
+            <w:r>
+              <w:t xml:space="preserve"> stock for the item </w:t>
             </w:r>
             <w:r>
               <w:t>Foam Roller</w:t>
@@ -3481,9 +2972,11 @@
         </w:rPr>
         <w:t xml:space="preserve"> </w:t>
       </w:r>
+      <w:proofErr w:type="gramStart"/>
       <w:r>
         <w:t>character</w:t>
       </w:r>
+      <w:proofErr w:type="gramEnd"/>
       <w:r>
         <w:rPr>
           <w:spacing w:val="-31"/>
@@ -3505,6 +2998,7 @@
         </w:rPr>
         <w:t></w:t>
       </w:r>
+      <w:proofErr w:type="gramStart"/>
       <w:r>
         <w:t>24</w:t>
       </w:r>
@@ -3517,6 +3011,7 @@
       <w:r>
         <w:t>line</w:t>
       </w:r>
+      <w:proofErr w:type="gramEnd"/>
       <w:r>
         <w:rPr>
           <w:spacing w:val="-31"/>
@@ -4763,19 +4258,33 @@
         <w:rPr>
           <w:w w:val="95"/>
         </w:rPr>
-        <w:t>UC8-Scen4-1</w:t>
-      </w:r>
-      <w:r>
-        <w:rPr>
-          <w:w w:val="95"/>
-        </w:rPr>
-        <w:t xml:space="preserve"> </w:t>
-      </w:r>
-      <w:r>
-        <w:rPr>
-          <w:w w:val="95"/>
-        </w:rPr>
-        <w:t xml:space="preserve">, UC run script </w:t>
+        <w:t>UC8-Scen4-</w:t>
+      </w:r>
+      <w:proofErr w:type="gramStart"/>
+      <w:r>
+        <w:rPr>
+          <w:w w:val="95"/>
+        </w:rPr>
+        <w:t>1</w:t>
+      </w:r>
+      <w:r>
+        <w:rPr>
+          <w:w w:val="95"/>
+        </w:rPr>
+        <w:t xml:space="preserve"> </w:t>
+      </w:r>
+      <w:r>
+        <w:rPr>
+          <w:w w:val="95"/>
+        </w:rPr>
+        <w:t>,</w:t>
+      </w:r>
+      <w:proofErr w:type="gramEnd"/>
+      <w:r>
+        <w:rPr>
+          <w:w w:val="95"/>
+        </w:rPr>
+        <w:t xml:space="preserve"> UC run script </w:t>
       </w:r>
       <w:r>
         <w:rPr>

</xml_diff>